<commit_message>
feat: add process service for PDF branding and populate storage assets
</commit_message>
<xml_diff>
--- a/storage/docs/copyright-url.docx
+++ b/storage/docs/copyright-url.docx
@@ -136,12 +136,43 @@
                       <w:r>
                         <w:rPr>
                           <w:rStyle w:val="Hyperlink"/>
+                          <w:b/>
+                          <w:bCs/>
                           <w:spacing w:val="-2"/>
                           <w:sz w:val="28"/>
                         </w:rPr>
                         <w:t>www.ijitest.org</w:t>
                       </w:r>
                     </w:hyperlink>
+                    <w:r>
+                      <w:tab/>
+                    </w:r>
+                    <w:r>
+                      <w:tab/>
+                    </w:r>
+                    <w:r>
+                      <w:tab/>
+                    </w:r>
+                    <w:r>
+                      <w:tab/>
+                    </w:r>
+                    <w:r>
+                      <w:tab/>
+                    </w:r>
+                    <w:r>
+                      <w:tab/>
+                    </w:r>
+                    <w:r>
+                      <w:tab/>
+                    </w:r>
+                    <w:r>
+                      <w:rPr>
+                        <w:b/>
+                        <w:bCs/>
+                        <w:color w:val="0000FF"/>
+                      </w:rPr>
+                      <w:t>E-ISSN: 3139-6887</w:t>
+                    </w:r>
                   </w:p>
                 </w:txbxContent>
               </v:textbox>

</xml_diff>